<commit_message>
chore: update example output files
</commit_message>
<xml_diff>
--- a/examples/output/docx/01-basic.docx
+++ b/examples/output/docx/01-basic.docx
@@ -78,4 +78,39 @@
     </w:p>
   </w:body>
 </w:document>
+</file>
+
+<file path=word/styles.xml><?xml version="1.0" encoding="utf-8"?>
+<w:styles xmlns:w="http://schemas.openxmlformats.org/wordprocessingml/2006/main">
+  <w:style w:type="paragraph" w:styleId="Heading1">
+    <w:name w:val="heading 1"/>
+    <w:basedOn w:val="Normal"/>
+    <w:pPr>
+      <w:keepNext/>
+      <w:spacing w:before="240" w:after="60"/>
+      <w:outlineLvl w:val="0"/>
+    </w:pPr>
+    <w:rPr>
+      <w:b/>
+      <w:bCs/>
+      <w:sz w:val="32"/>
+      <w:szCs w:val="32"/>
+    </w:rPr>
+  </w:style>
+  <w:style w:type="paragraph" w:styleId="Heading2">
+    <w:name w:val="heading 2"/>
+    <w:basedOn w:val="Normal"/>
+    <w:pPr>
+      <w:keepNext/>
+      <w:spacing w:before="210" w:after="60"/>
+      <w:outlineLvl w:val="1"/>
+    </w:pPr>
+    <w:rPr>
+      <w:b/>
+      <w:bCs/>
+      <w:sz w:val="26"/>
+      <w:szCs w:val="26"/>
+    </w:rPr>
+  </w:style>
+</w:styles>
 </file>
</xml_diff>